<commit_message>
updated Project-Plan with summary tables
</commit_message>
<xml_diff>
--- a/PlanDataModelAndDesign/project-plan.docx
+++ b/PlanDataModelAndDesign/project-plan.docx
@@ -407,15 +407,7 @@
                     </w:rPr>
                   </w:pPr>
                   <w:r>
-                    <w:t xml:space="preserve">As a user, I want to define a start date for my tasks (defaulting to today) so that I can </w:t>
-                  </w:r>
-                  <w:proofErr w:type="gramStart"/>
-                  <w:r>
-                    <w:t>plan ahead</w:t>
-                  </w:r>
-                  <w:proofErr w:type="gramEnd"/>
-                  <w:r>
-                    <w:t xml:space="preserve"> or delay the beginning of recurring responsibilities.</w:t>
+                    <w:t>As a user, I want to define a start date for my tasks (defaulting to today) so that I can plan ahead or delay the beginning of recurring responsibilities.</w:t>
                   </w:r>
                 </w:p>
               </w:tc>
@@ -1681,15 +1673,7 @@
         <w:t>project schedule broken down by sprint</w:t>
       </w:r>
       <w:r>
-        <w:t xml:space="preserve">.  For each sprint list the milestones you will meet.  This is a rough guideline for future </w:t>
-      </w:r>
-      <w:proofErr w:type="gramStart"/>
-      <w:r>
-        <w:t>planning,</w:t>
-      </w:r>
-      <w:proofErr w:type="gramEnd"/>
-      <w:r>
-        <w:t xml:space="preserve"> you will make a more detailed plan at </w:t>
+        <w:t xml:space="preserve">.  For each sprint list the milestones you will meet.  This is a rough guideline for future planning, you will make a more detailed plan at </w:t>
       </w:r>
       <w:r>
         <w:lastRenderedPageBreak/>
@@ -2322,6 +2306,7 @@
           <w:bCs/>
           <w:lang w:val="pt-BR" w:eastAsia="pt-BR"/>
         </w:rPr>
+        <w:lastRenderedPageBreak/>
         <w:t>Purpose</w:t>
       </w:r>
       <w:proofErr w:type="spellEnd"/>
@@ -2469,7 +2454,6 @@
           <w:bCs/>
           <w:lang w:val="pt-BR" w:eastAsia="pt-BR"/>
         </w:rPr>
-        <w:lastRenderedPageBreak/>
         <w:t>Backend</w:t>
       </w:r>
       <w:proofErr w:type="spellEnd"/>
@@ -3419,15 +3403,7 @@
     </w:p>
     <w:p>
       <w:r>
-        <w:t xml:space="preserve">Frontend (React, hosted on </w:t>
-      </w:r>
-      <w:proofErr w:type="spellStart"/>
-      <w:r>
-        <w:t>Vercel</w:t>
-      </w:r>
-      <w:proofErr w:type="spellEnd"/>
-      <w:r>
-        <w:t>)</w:t>
+        <w:t>Frontend (React, hosted on Vercel)</w:t>
       </w:r>
     </w:p>
     <w:p>
@@ -3738,6 +3714,7 @@
           <w:sz w:val="22"/>
           <w:szCs w:val="22"/>
         </w:rPr>
+        <w:lastRenderedPageBreak/>
         <w:t>POST /auth/login</w:t>
       </w:r>
     </w:p>
@@ -3982,7 +3959,6 @@
           <w:sz w:val="22"/>
           <w:szCs w:val="22"/>
         </w:rPr>
-        <w:lastRenderedPageBreak/>
         <w:t>GET /users/:id</w:t>
       </w:r>
     </w:p>
@@ -4276,11 +4252,9 @@
       </w:r>
     </w:p>
     <w:p>
-      <w:proofErr w:type="spellStart"/>
       <w:r>
         <w:t>json</w:t>
       </w:r>
-      <w:proofErr w:type="spellEnd"/>
     </w:p>
     <w:p>
       <w:pPr>
@@ -4905,10 +4879,7 @@
       </w:r>
       <w:proofErr w:type="gramStart"/>
       <w:r>
-        <w:t>params:</w:t>
-      </w:r>
-      <w:r>
-        <w:t>?</w:t>
+        <w:t>params:?</w:t>
       </w:r>
       <w:proofErr w:type="spellStart"/>
       <w:proofErr w:type="gramEnd"/>
@@ -4932,38 +4903,12 @@
     </w:p>
     <w:p>
       <w:r>
-        <w:t xml:space="preserve">    "</w:t>
-      </w:r>
-      <w:proofErr w:type="spellStart"/>
-      <w:proofErr w:type="gramStart"/>
-      <w:r>
-        <w:t>instance</w:t>
-      </w:r>
-      <w:proofErr w:type="gramEnd"/>
-      <w:r>
-        <w:t>_id</w:t>
-      </w:r>
-      <w:proofErr w:type="spellEnd"/>
-      <w:r>
-        <w:t>": "inst1",</w:t>
+        <w:t xml:space="preserve">    "instance_id": "inst1",</w:t>
       </w:r>
     </w:p>
     <w:p>
       <w:r>
-        <w:t xml:space="preserve">    "</w:t>
-      </w:r>
-      <w:proofErr w:type="spellStart"/>
-      <w:proofErr w:type="gramStart"/>
-      <w:r>
-        <w:t>task</w:t>
-      </w:r>
-      <w:proofErr w:type="gramEnd"/>
-      <w:r>
-        <w:t>_id</w:t>
-      </w:r>
-      <w:proofErr w:type="spellEnd"/>
-      <w:r>
-        <w:t>": "task1",</w:t>
+        <w:t xml:space="preserve">    "task_id": "task1",</w:t>
       </w:r>
     </w:p>
     <w:p>
@@ -4973,20 +4918,7 @@
     </w:p>
     <w:p>
       <w:r>
-        <w:t xml:space="preserve">    "</w:t>
-      </w:r>
-      <w:proofErr w:type="spellStart"/>
-      <w:proofErr w:type="gramStart"/>
-      <w:r>
-        <w:t>scheduled</w:t>
-      </w:r>
-      <w:proofErr w:type="gramEnd"/>
-      <w:r>
-        <w:t>_date</w:t>
-      </w:r>
-      <w:proofErr w:type="spellEnd"/>
-      <w:r>
-        <w:t>": "2026-03-10",</w:t>
+        <w:t xml:space="preserve">    "scheduled_date": "2026-03-10",</w:t>
       </w:r>
     </w:p>
     <w:p>
@@ -5001,6 +4933,7 @@
     </w:p>
     <w:p>
       <w:r>
+        <w:lastRenderedPageBreak/>
         <w:t xml:space="preserve">  },</w:t>
       </w:r>
     </w:p>
@@ -5011,38 +4944,12 @@
     </w:p>
     <w:p>
       <w:r>
-        <w:t xml:space="preserve">    "</w:t>
-      </w:r>
-      <w:proofErr w:type="spellStart"/>
-      <w:proofErr w:type="gramStart"/>
-      <w:r>
-        <w:t>instance</w:t>
-      </w:r>
-      <w:proofErr w:type="gramEnd"/>
-      <w:r>
-        <w:t>_id</w:t>
-      </w:r>
-      <w:proofErr w:type="spellEnd"/>
-      <w:r>
-        <w:t>": "inst2",</w:t>
+        <w:t xml:space="preserve">    "instance_id": "inst2",</w:t>
       </w:r>
     </w:p>
     <w:p>
       <w:r>
-        <w:t xml:space="preserve">    "</w:t>
-      </w:r>
-      <w:proofErr w:type="spellStart"/>
-      <w:proofErr w:type="gramStart"/>
-      <w:r>
-        <w:t>task</w:t>
-      </w:r>
-      <w:proofErr w:type="gramEnd"/>
-      <w:r>
-        <w:t>_id</w:t>
-      </w:r>
-      <w:proofErr w:type="spellEnd"/>
-      <w:r>
-        <w:t>": "task1",</w:t>
+        <w:t xml:space="preserve">    "task_id": "task1",</w:t>
       </w:r>
     </w:p>
     <w:p>
@@ -5052,21 +4959,7 @@
     </w:p>
     <w:p>
       <w:r>
-        <w:lastRenderedPageBreak/>
-        <w:t xml:space="preserve">    "</w:t>
-      </w:r>
-      <w:proofErr w:type="spellStart"/>
-      <w:proofErr w:type="gramStart"/>
-      <w:r>
-        <w:t>scheduled</w:t>
-      </w:r>
-      <w:proofErr w:type="gramEnd"/>
-      <w:r>
-        <w:t>_date</w:t>
-      </w:r>
-      <w:proofErr w:type="spellEnd"/>
-      <w:r>
-        <w:t>": "2026-03-13",</w:t>
+        <w:t xml:space="preserve">    "scheduled_date": "2026-03-13",</w:t>
       </w:r>
     </w:p>
     <w:p>
@@ -5111,16 +5004,7 @@
           <w:sz w:val="22"/>
           <w:szCs w:val="22"/>
         </w:rPr>
-        <w:t>Done</w:t>
-      </w:r>
-      <w:r>
-        <w:rPr>
-          <w:rStyle w:val="HTMLCode"/>
-          <w:rFonts w:asciiTheme="minorHAnsi" w:eastAsiaTheme="majorEastAsia" w:hAnsiTheme="minorHAnsi"/>
-          <w:sz w:val="22"/>
-          <w:szCs w:val="22"/>
-        </w:rPr>
-        <w:t xml:space="preserve"> </w:t>
+        <w:t xml:space="preserve">Done </w:t>
       </w:r>
       <w:r>
         <w:rPr>
@@ -5416,11 +5300,9 @@
       </w:r>
     </w:p>
     <w:p>
-      <w:proofErr w:type="spellStart"/>
       <w:r>
         <w:t>json</w:t>
       </w:r>
-      <w:proofErr w:type="spellEnd"/>
     </w:p>
     <w:p>
       <w:pPr>
@@ -6134,6 +6016,7 @@
           <w:sz w:val="22"/>
           <w:szCs w:val="22"/>
         </w:rPr>
+        <w:lastRenderedPageBreak/>
         <w:t>DELETE /tasks/:id</w:t>
       </w:r>
     </w:p>
@@ -6236,7 +6119,6 @@
           <w:sz w:val="22"/>
           <w:szCs w:val="22"/>
         </w:rPr>
-        <w:lastRenderedPageBreak/>
         <w:t>🗂</w:t>
       </w:r>
       <w:r>
@@ -7648,6 +7530,7 @@
           <w:sz w:val="22"/>
           <w:szCs w:val="22"/>
         </w:rPr>
+        <w:lastRenderedPageBreak/>
         <w:t>GET /tasks/:id/days</w:t>
       </w:r>
     </w:p>
@@ -7737,7 +7620,6 @@
           <w:sz w:val="22"/>
           <w:szCs w:val="22"/>
         </w:rPr>
-        <w:lastRenderedPageBreak/>
         <w:t>🔔</w:t>
       </w:r>
       <w:r>
@@ -7800,11 +7682,9 @@
       </w:r>
     </w:p>
     <w:p>
-      <w:proofErr w:type="spellStart"/>
       <w:r>
         <w:t>json</w:t>
       </w:r>
-      <w:proofErr w:type="spellEnd"/>
     </w:p>
     <w:p>
       <w:pPr>
@@ -8178,6 +8058,1476 @@
         </w:rPr>
         <w:t>]</w:t>
       </w:r>
+    </w:p>
+    <w:p>
+      <w:pPr>
+        <w:pStyle w:val="HTMLPreformatted"/>
+        <w:rPr>
+          <w:rStyle w:val="HTMLCode"/>
+          <w:rFonts w:asciiTheme="minorHAnsi" w:eastAsiaTheme="majorEastAsia" w:hAnsiTheme="minorHAnsi"/>
+          <w:sz w:val="22"/>
+          <w:szCs w:val="22"/>
+        </w:rPr>
+      </w:pPr>
+    </w:p>
+    <w:p>
+      <w:pPr>
+        <w:pStyle w:val="HTMLPreformatted"/>
+        <w:rPr>
+          <w:rStyle w:val="HTMLCode"/>
+          <w:rFonts w:asciiTheme="minorHAnsi" w:eastAsiaTheme="majorEastAsia" w:hAnsiTheme="minorHAnsi"/>
+          <w:sz w:val="22"/>
+          <w:szCs w:val="22"/>
+        </w:rPr>
+      </w:pPr>
+    </w:p>
+    <w:p>
+      <w:pPr>
+        <w:pStyle w:val="Heading1"/>
+        <w:rPr>
+          <w:sz w:val="48"/>
+          <w:szCs w:val="48"/>
+        </w:rPr>
+      </w:pPr>
+      <w:proofErr w:type="spellStart"/>
+      <w:r>
+        <w:t>FlowTasks</w:t>
+      </w:r>
+      <w:proofErr w:type="spellEnd"/>
+      <w:r>
+        <w:t xml:space="preserve"> API Endpoints</w:t>
+      </w:r>
+    </w:p>
+    <w:tbl>
+      <w:tblPr>
+        <w:tblW w:w="0" w:type="auto"/>
+        <w:tblCellSpacing w:w="15" w:type="dxa"/>
+        <w:tblCellMar>
+          <w:top w:w="15" w:type="dxa"/>
+          <w:left w:w="15" w:type="dxa"/>
+          <w:bottom w:w="15" w:type="dxa"/>
+          <w:right w:w="15" w:type="dxa"/>
+        </w:tblCellMar>
+        <w:tblLook w:val="04A0" w:firstRow="1" w:lastRow="0" w:firstColumn="1" w:lastColumn="0" w:noHBand="0" w:noVBand="1"/>
+      </w:tblPr>
+      <w:tblGrid>
+        <w:gridCol w:w="2356"/>
+        <w:gridCol w:w="967"/>
+        <w:gridCol w:w="3506"/>
+        <w:gridCol w:w="2531"/>
+      </w:tblGrid>
+      <w:tr>
+        <w:trPr>
+          <w:tblHeader/>
+          <w:tblCellSpacing w:w="15" w:type="dxa"/>
+        </w:trPr>
+        <w:tc>
+          <w:tcPr>
+            <w:tcW w:w="0" w:type="auto"/>
+            <w:vAlign w:val="center"/>
+            <w:hideMark/>
+          </w:tcPr>
+          <w:p>
+            <w:pPr>
+              <w:jc w:val="center"/>
+              <w:rPr>
+                <w:b/>
+                <w:bCs/>
+              </w:rPr>
+            </w:pPr>
+            <w:r>
+              <w:rPr>
+                <w:b/>
+                <w:bCs/>
+              </w:rPr>
+              <w:t>Endpoint</w:t>
+            </w:r>
+          </w:p>
+        </w:tc>
+        <w:tc>
+          <w:tcPr>
+            <w:tcW w:w="0" w:type="auto"/>
+            <w:vAlign w:val="center"/>
+            <w:hideMark/>
+          </w:tcPr>
+          <w:p>
+            <w:pPr>
+              <w:jc w:val="center"/>
+              <w:rPr>
+                <w:b/>
+                <w:bCs/>
+              </w:rPr>
+            </w:pPr>
+            <w:r>
+              <w:rPr>
+                <w:b/>
+                <w:bCs/>
+              </w:rPr>
+              <w:t>Method</w:t>
+            </w:r>
+          </w:p>
+        </w:tc>
+        <w:tc>
+          <w:tcPr>
+            <w:tcW w:w="0" w:type="auto"/>
+            <w:vAlign w:val="center"/>
+            <w:hideMark/>
+          </w:tcPr>
+          <w:p>
+            <w:pPr>
+              <w:jc w:val="center"/>
+              <w:rPr>
+                <w:b/>
+                <w:bCs/>
+              </w:rPr>
+            </w:pPr>
+            <w:r>
+              <w:rPr>
+                <w:b/>
+                <w:bCs/>
+              </w:rPr>
+              <w:t>Returns</w:t>
+            </w:r>
+          </w:p>
+        </w:tc>
+        <w:tc>
+          <w:tcPr>
+            <w:tcW w:w="0" w:type="auto"/>
+            <w:vAlign w:val="center"/>
+            <w:hideMark/>
+          </w:tcPr>
+          <w:p>
+            <w:pPr>
+              <w:jc w:val="center"/>
+              <w:rPr>
+                <w:b/>
+                <w:bCs/>
+              </w:rPr>
+            </w:pPr>
+            <w:r>
+              <w:rPr>
+                <w:b/>
+                <w:bCs/>
+              </w:rPr>
+              <w:t>Purpose</w:t>
+            </w:r>
+          </w:p>
+        </w:tc>
+      </w:tr>
+      <w:tr>
+        <w:trPr>
+          <w:tblCellSpacing w:w="15" w:type="dxa"/>
+        </w:trPr>
+        <w:tc>
+          <w:tcPr>
+            <w:tcW w:w="0" w:type="auto"/>
+            <w:vAlign w:val="center"/>
+            <w:hideMark/>
+          </w:tcPr>
+          <w:p>
+            <w:r>
+              <w:rPr>
+                <w:rStyle w:val="HTMLCode"/>
+                <w:rFonts w:eastAsiaTheme="majorEastAsia"/>
+              </w:rPr>
+              <w:t>/auth/register</w:t>
+            </w:r>
+          </w:p>
+        </w:tc>
+        <w:tc>
+          <w:tcPr>
+            <w:tcW w:w="0" w:type="auto"/>
+            <w:vAlign w:val="center"/>
+            <w:hideMark/>
+          </w:tcPr>
+          <w:p>
+            <w:r>
+              <w:t>POST</w:t>
+            </w:r>
+          </w:p>
+        </w:tc>
+        <w:tc>
+          <w:tcPr>
+            <w:tcW w:w="0" w:type="auto"/>
+            <w:vAlign w:val="center"/>
+            <w:hideMark/>
+          </w:tcPr>
+          <w:p>
+            <w:r>
+              <w:rPr>
+                <w:rStyle w:val="HTMLCode"/>
+                <w:rFonts w:eastAsiaTheme="majorEastAsia"/>
+              </w:rPr>
+              <w:t>{ id, name, email }</w:t>
+            </w:r>
+          </w:p>
+        </w:tc>
+        <w:tc>
+          <w:tcPr>
+            <w:tcW w:w="0" w:type="auto"/>
+            <w:vAlign w:val="center"/>
+            <w:hideMark/>
+          </w:tcPr>
+          <w:p>
+            <w:r>
+              <w:t>Creates a new user account.</w:t>
+            </w:r>
+          </w:p>
+        </w:tc>
+      </w:tr>
+      <w:tr>
+        <w:trPr>
+          <w:tblCellSpacing w:w="15" w:type="dxa"/>
+        </w:trPr>
+        <w:tc>
+          <w:tcPr>
+            <w:tcW w:w="0" w:type="auto"/>
+            <w:vAlign w:val="center"/>
+            <w:hideMark/>
+          </w:tcPr>
+          <w:p>
+            <w:r>
+              <w:rPr>
+                <w:rStyle w:val="HTMLCode"/>
+                <w:rFonts w:eastAsiaTheme="majorEastAsia"/>
+              </w:rPr>
+              <w:t>/auth/login</w:t>
+            </w:r>
+          </w:p>
+        </w:tc>
+        <w:tc>
+          <w:tcPr>
+            <w:tcW w:w="0" w:type="auto"/>
+            <w:vAlign w:val="center"/>
+            <w:hideMark/>
+          </w:tcPr>
+          <w:p>
+            <w:r>
+              <w:t>POST</w:t>
+            </w:r>
+          </w:p>
+        </w:tc>
+        <w:tc>
+          <w:tcPr>
+            <w:tcW w:w="0" w:type="auto"/>
+            <w:vAlign w:val="center"/>
+            <w:hideMark/>
+          </w:tcPr>
+          <w:p>
+            <w:r>
+              <w:rPr>
+                <w:rStyle w:val="HTMLCode"/>
+                <w:rFonts w:eastAsiaTheme="majorEastAsia"/>
+              </w:rPr>
+              <w:t>{ token, user }</w:t>
+            </w:r>
+          </w:p>
+        </w:tc>
+        <w:tc>
+          <w:tcPr>
+            <w:tcW w:w="0" w:type="auto"/>
+            <w:vAlign w:val="center"/>
+            <w:hideMark/>
+          </w:tcPr>
+          <w:p>
+            <w:r>
+              <w:t>Authenticates the user and returns a JWT token.</w:t>
+            </w:r>
+          </w:p>
+        </w:tc>
+      </w:tr>
+      <w:tr>
+        <w:trPr>
+          <w:tblCellSpacing w:w="15" w:type="dxa"/>
+        </w:trPr>
+        <w:tc>
+          <w:tcPr>
+            <w:tcW w:w="0" w:type="auto"/>
+            <w:vAlign w:val="center"/>
+            <w:hideMark/>
+          </w:tcPr>
+          <w:p>
+            <w:r>
+              <w:rPr>
+                <w:rStyle w:val="HTMLCode"/>
+                <w:rFonts w:eastAsiaTheme="majorEastAsia"/>
+              </w:rPr>
+              <w:t>/</w:t>
+            </w:r>
+            <w:r>
+              <w:rPr>
+                <w:rStyle w:val="HTMLCode"/>
+                <w:rFonts w:eastAsiaTheme="majorEastAsia"/>
+              </w:rPr>
+              <w:t>user/:id</w:t>
+            </w:r>
+          </w:p>
+        </w:tc>
+        <w:tc>
+          <w:tcPr>
+            <w:tcW w:w="0" w:type="auto"/>
+            <w:vAlign w:val="center"/>
+            <w:hideMark/>
+          </w:tcPr>
+          <w:p>
+            <w:r>
+              <w:t>GET</w:t>
+            </w:r>
+          </w:p>
+        </w:tc>
+        <w:tc>
+          <w:tcPr>
+            <w:tcW w:w="0" w:type="auto"/>
+            <w:vAlign w:val="center"/>
+            <w:hideMark/>
+          </w:tcPr>
+          <w:p>
+            <w:r>
+              <w:rPr>
+                <w:rStyle w:val="HTMLCode"/>
+                <w:rFonts w:eastAsiaTheme="majorEastAsia"/>
+              </w:rPr>
+              <w:t>{ id, name, email }</w:t>
+            </w:r>
+          </w:p>
+        </w:tc>
+        <w:tc>
+          <w:tcPr>
+            <w:tcW w:w="0" w:type="auto"/>
+            <w:vAlign w:val="center"/>
+            <w:hideMark/>
+          </w:tcPr>
+          <w:p>
+            <w:r>
+              <w:t>Returns the authenticated user's profile information.</w:t>
+            </w:r>
+          </w:p>
+        </w:tc>
+      </w:tr>
+      <w:tr>
+        <w:trPr>
+          <w:tblCellSpacing w:w="15" w:type="dxa"/>
+        </w:trPr>
+        <w:tc>
+          <w:tcPr>
+            <w:tcW w:w="0" w:type="auto"/>
+            <w:vAlign w:val="center"/>
+            <w:hideMark/>
+          </w:tcPr>
+          <w:p>
+            <w:r>
+              <w:rPr>
+                <w:rStyle w:val="HTMLCode"/>
+                <w:rFonts w:eastAsiaTheme="majorEastAsia"/>
+              </w:rPr>
+              <w:t>/tasks</w:t>
+            </w:r>
+          </w:p>
+        </w:tc>
+        <w:tc>
+          <w:tcPr>
+            <w:tcW w:w="0" w:type="auto"/>
+            <w:vAlign w:val="center"/>
+            <w:hideMark/>
+          </w:tcPr>
+          <w:p>
+            <w:r>
+              <w:t>GET</w:t>
+            </w:r>
+          </w:p>
+        </w:tc>
+        <w:tc>
+          <w:tcPr>
+            <w:tcW w:w="0" w:type="auto"/>
+            <w:vAlign w:val="center"/>
+            <w:hideMark/>
+          </w:tcPr>
+          <w:p>
+            <w:r>
+              <w:rPr>
+                <w:rStyle w:val="HTMLCode"/>
+                <w:rFonts w:eastAsiaTheme="majorEastAsia"/>
+              </w:rPr>
+              <w:t>[ { id, title, description, category, priority, frequency, isActive, created_at } ]</w:t>
+            </w:r>
+          </w:p>
+        </w:tc>
+        <w:tc>
+          <w:tcPr>
+            <w:tcW w:w="0" w:type="auto"/>
+            <w:vAlign w:val="center"/>
+            <w:hideMark/>
+          </w:tcPr>
+          <w:p>
+            <w:r>
+              <w:t>Retrieves all task definitions created by the user. Used for managing tasks.</w:t>
+            </w:r>
+          </w:p>
+        </w:tc>
+      </w:tr>
+      <w:tr>
+        <w:trPr>
+          <w:tblCellSpacing w:w="15" w:type="dxa"/>
+        </w:trPr>
+        <w:tc>
+          <w:tcPr>
+            <w:tcW w:w="0" w:type="auto"/>
+            <w:vAlign w:val="center"/>
+            <w:hideMark/>
+          </w:tcPr>
+          <w:p>
+            <w:r>
+              <w:rPr>
+                <w:rStyle w:val="HTMLCode"/>
+                <w:rFonts w:eastAsiaTheme="majorEastAsia"/>
+              </w:rPr>
+              <w:t>/tasks</w:t>
+            </w:r>
+          </w:p>
+        </w:tc>
+        <w:tc>
+          <w:tcPr>
+            <w:tcW w:w="0" w:type="auto"/>
+            <w:vAlign w:val="center"/>
+            <w:hideMark/>
+          </w:tcPr>
+          <w:p>
+            <w:r>
+              <w:t>POST</w:t>
+            </w:r>
+          </w:p>
+        </w:tc>
+        <w:tc>
+          <w:tcPr>
+            <w:tcW w:w="0" w:type="auto"/>
+            <w:vAlign w:val="center"/>
+            <w:hideMark/>
+          </w:tcPr>
+          <w:p>
+            <w:r>
+              <w:rPr>
+                <w:rStyle w:val="HTMLCode"/>
+                <w:rFonts w:eastAsiaTheme="majorEastAsia"/>
+              </w:rPr>
+              <w:t>{ id, title, description, category, priority, frequency, weekdays }</w:t>
+            </w:r>
+          </w:p>
+        </w:tc>
+        <w:tc>
+          <w:tcPr>
+            <w:tcW w:w="0" w:type="auto"/>
+            <w:vAlign w:val="center"/>
+            <w:hideMark/>
+          </w:tcPr>
+          <w:p>
+            <w:r>
+              <w:t>Creates a new recurring task with its schedule configuration.</w:t>
+            </w:r>
+          </w:p>
+        </w:tc>
+      </w:tr>
+      <w:tr>
+        <w:trPr>
+          <w:tblCellSpacing w:w="15" w:type="dxa"/>
+        </w:trPr>
+        <w:tc>
+          <w:tcPr>
+            <w:tcW w:w="0" w:type="auto"/>
+            <w:vAlign w:val="center"/>
+            <w:hideMark/>
+          </w:tcPr>
+          <w:p>
+            <w:r>
+              <w:rPr>
+                <w:rStyle w:val="HTMLCode"/>
+                <w:rFonts w:eastAsiaTheme="majorEastAsia"/>
+              </w:rPr>
+              <w:t>/tasks/:id</w:t>
+            </w:r>
+          </w:p>
+        </w:tc>
+        <w:tc>
+          <w:tcPr>
+            <w:tcW w:w="0" w:type="auto"/>
+            <w:vAlign w:val="center"/>
+            <w:hideMark/>
+          </w:tcPr>
+          <w:p>
+            <w:r>
+              <w:t>PUT</w:t>
+            </w:r>
+          </w:p>
+        </w:tc>
+        <w:tc>
+          <w:tcPr>
+            <w:tcW w:w="0" w:type="auto"/>
+            <w:vAlign w:val="center"/>
+            <w:hideMark/>
+          </w:tcPr>
+          <w:p>
+            <w:r>
+              <w:rPr>
+                <w:rStyle w:val="HTMLCode"/>
+                <w:rFonts w:eastAsiaTheme="majorEastAsia"/>
+              </w:rPr>
+              <w:t>{ id, title, description, category, priority, frequency, weekdays }</w:t>
+            </w:r>
+          </w:p>
+        </w:tc>
+        <w:tc>
+          <w:tcPr>
+            <w:tcW w:w="0" w:type="auto"/>
+            <w:vAlign w:val="center"/>
+            <w:hideMark/>
+          </w:tcPr>
+          <w:p>
+            <w:r>
+              <w:t>Updates an existing task definition and schedule.</w:t>
+            </w:r>
+          </w:p>
+        </w:tc>
+      </w:tr>
+      <w:tr>
+        <w:trPr>
+          <w:tblCellSpacing w:w="15" w:type="dxa"/>
+        </w:trPr>
+        <w:tc>
+          <w:tcPr>
+            <w:tcW w:w="0" w:type="auto"/>
+            <w:vAlign w:val="center"/>
+            <w:hideMark/>
+          </w:tcPr>
+          <w:p>
+            <w:r>
+              <w:rPr>
+                <w:rStyle w:val="HTMLCode"/>
+                <w:rFonts w:eastAsiaTheme="majorEastAsia"/>
+              </w:rPr>
+              <w:t>/tasks/:id</w:t>
+            </w:r>
+          </w:p>
+        </w:tc>
+        <w:tc>
+          <w:tcPr>
+            <w:tcW w:w="0" w:type="auto"/>
+            <w:vAlign w:val="center"/>
+            <w:hideMark/>
+          </w:tcPr>
+          <w:p>
+            <w:r>
+              <w:t>DELETE</w:t>
+            </w:r>
+          </w:p>
+        </w:tc>
+        <w:tc>
+          <w:tcPr>
+            <w:tcW w:w="0" w:type="auto"/>
+            <w:vAlign w:val="center"/>
+            <w:hideMark/>
+          </w:tcPr>
+          <w:p>
+            <w:r>
+              <w:rPr>
+                <w:rStyle w:val="HTMLCode"/>
+                <w:rFonts w:eastAsiaTheme="majorEastAsia"/>
+              </w:rPr>
+              <w:t>{ success: true }</w:t>
+            </w:r>
+          </w:p>
+        </w:tc>
+        <w:tc>
+          <w:tcPr>
+            <w:tcW w:w="0" w:type="auto"/>
+            <w:vAlign w:val="center"/>
+            <w:hideMark/>
+          </w:tcPr>
+          <w:p>
+            <w:r>
+              <w:t>Deletes a task and all related task instances.</w:t>
+            </w:r>
+          </w:p>
+        </w:tc>
+      </w:tr>
+      <w:tr>
+        <w:trPr>
+          <w:tblCellSpacing w:w="15" w:type="dxa"/>
+        </w:trPr>
+        <w:tc>
+          <w:tcPr>
+            <w:tcW w:w="0" w:type="auto"/>
+            <w:vAlign w:val="center"/>
+            <w:hideMark/>
+          </w:tcPr>
+          <w:p>
+            <w:r>
+              <w:rPr>
+                <w:rStyle w:val="HTMLCode"/>
+                <w:rFonts w:eastAsiaTheme="majorEastAsia"/>
+              </w:rPr>
+              <w:t>/tasks/:id/schedule</w:t>
+            </w:r>
+          </w:p>
+        </w:tc>
+        <w:tc>
+          <w:tcPr>
+            <w:tcW w:w="0" w:type="auto"/>
+            <w:vAlign w:val="center"/>
+            <w:hideMark/>
+          </w:tcPr>
+          <w:p>
+            <w:r>
+              <w:t>GET</w:t>
+            </w:r>
+          </w:p>
+        </w:tc>
+        <w:tc>
+          <w:tcPr>
+            <w:tcW w:w="0" w:type="auto"/>
+            <w:vAlign w:val="center"/>
+            <w:hideMark/>
+          </w:tcPr>
+          <w:p>
+            <w:r>
+              <w:rPr>
+                <w:rStyle w:val="HTMLCode"/>
+                <w:rFonts w:eastAsiaTheme="majorEastAsia"/>
+              </w:rPr>
+              <w:t>{ frequency, weekdays }</w:t>
+            </w:r>
+          </w:p>
+        </w:tc>
+        <w:tc>
+          <w:tcPr>
+            <w:tcW w:w="0" w:type="auto"/>
+            <w:vAlign w:val="center"/>
+            <w:hideMark/>
+          </w:tcPr>
+          <w:p>
+            <w:r>
+              <w:t>Returns scheduling configuration for a specific task.</w:t>
+            </w:r>
+          </w:p>
+        </w:tc>
+      </w:tr>
+      <w:tr>
+        <w:trPr>
+          <w:tblCellSpacing w:w="15" w:type="dxa"/>
+        </w:trPr>
+        <w:tc>
+          <w:tcPr>
+            <w:tcW w:w="0" w:type="auto"/>
+            <w:vAlign w:val="center"/>
+            <w:hideMark/>
+          </w:tcPr>
+          <w:p>
+            <w:r>
+              <w:rPr>
+                <w:rStyle w:val="HTMLCode"/>
+                <w:rFonts w:eastAsiaTheme="majorEastAsia"/>
+              </w:rPr>
+              <w:lastRenderedPageBreak/>
+              <w:t>/tasks/:id/schedule</w:t>
+            </w:r>
+          </w:p>
+        </w:tc>
+        <w:tc>
+          <w:tcPr>
+            <w:tcW w:w="0" w:type="auto"/>
+            <w:vAlign w:val="center"/>
+            <w:hideMark/>
+          </w:tcPr>
+          <w:p>
+            <w:r>
+              <w:t>PUT</w:t>
+            </w:r>
+          </w:p>
+        </w:tc>
+        <w:tc>
+          <w:tcPr>
+            <w:tcW w:w="0" w:type="auto"/>
+            <w:vAlign w:val="center"/>
+            <w:hideMark/>
+          </w:tcPr>
+          <w:p>
+            <w:r>
+              <w:rPr>
+                <w:rStyle w:val="HTMLCode"/>
+                <w:rFonts w:eastAsiaTheme="majorEastAsia"/>
+              </w:rPr>
+              <w:t>{ success: true }</w:t>
+            </w:r>
+          </w:p>
+        </w:tc>
+        <w:tc>
+          <w:tcPr>
+            <w:tcW w:w="0" w:type="auto"/>
+            <w:vAlign w:val="center"/>
+            <w:hideMark/>
+          </w:tcPr>
+          <w:p>
+            <w:r>
+              <w:t>Updates the recurring schedule (days of week, frequency).</w:t>
+            </w:r>
+          </w:p>
+        </w:tc>
+      </w:tr>
+      <w:tr>
+        <w:trPr>
+          <w:tblCellSpacing w:w="15" w:type="dxa"/>
+        </w:trPr>
+        <w:tc>
+          <w:tcPr>
+            <w:tcW w:w="0" w:type="auto"/>
+            <w:vAlign w:val="center"/>
+            <w:hideMark/>
+          </w:tcPr>
+          <w:p>
+            <w:r>
+              <w:rPr>
+                <w:rStyle w:val="HTMLCode"/>
+                <w:rFonts w:eastAsiaTheme="majorEastAsia"/>
+              </w:rPr>
+              <w:t>/schedule</w:t>
+            </w:r>
+          </w:p>
+        </w:tc>
+        <w:tc>
+          <w:tcPr>
+            <w:tcW w:w="0" w:type="auto"/>
+            <w:vAlign w:val="center"/>
+            <w:hideMark/>
+          </w:tcPr>
+          <w:p>
+            <w:r>
+              <w:t>GET</w:t>
+            </w:r>
+          </w:p>
+        </w:tc>
+        <w:tc>
+          <w:tcPr>
+            <w:tcW w:w="0" w:type="auto"/>
+            <w:vAlign w:val="center"/>
+            <w:hideMark/>
+          </w:tcPr>
+          <w:p>
+            <w:r>
+              <w:rPr>
+                <w:rStyle w:val="HTMLCode"/>
+                <w:rFonts w:eastAsiaTheme="majorEastAsia"/>
+              </w:rPr>
+              <w:t>[ { instance_id, task_id, title, scheduled_date, status, priority } ]</w:t>
+            </w:r>
+          </w:p>
+        </w:tc>
+        <w:tc>
+          <w:tcPr>
+            <w:tcW w:w="0" w:type="auto"/>
+            <w:vAlign w:val="center"/>
+            <w:hideMark/>
+          </w:tcPr>
+          <w:p>
+            <w:r>
+              <w:t>Returns all task instances for a specific week (used for the weekly planner UI).</w:t>
+            </w:r>
+          </w:p>
+        </w:tc>
+      </w:tr>
+      <w:tr>
+        <w:trPr>
+          <w:tblCellSpacing w:w="15" w:type="dxa"/>
+        </w:trPr>
+        <w:tc>
+          <w:tcPr>
+            <w:tcW w:w="0" w:type="auto"/>
+            <w:vAlign w:val="center"/>
+            <w:hideMark/>
+          </w:tcPr>
+          <w:p>
+            <w:r>
+              <w:rPr>
+                <w:rStyle w:val="HTMLCode"/>
+                <w:rFonts w:eastAsiaTheme="majorEastAsia"/>
+              </w:rPr>
+              <w:t>/task-instances/:id</w:t>
+            </w:r>
+          </w:p>
+        </w:tc>
+        <w:tc>
+          <w:tcPr>
+            <w:tcW w:w="0" w:type="auto"/>
+            <w:vAlign w:val="center"/>
+            <w:hideMark/>
+          </w:tcPr>
+          <w:p>
+            <w:r>
+              <w:t>PATCH</w:t>
+            </w:r>
+          </w:p>
+        </w:tc>
+        <w:tc>
+          <w:tcPr>
+            <w:tcW w:w="0" w:type="auto"/>
+            <w:vAlign w:val="center"/>
+            <w:hideMark/>
+          </w:tcPr>
+          <w:p>
+            <w:r>
+              <w:rPr>
+                <w:rStyle w:val="HTMLCode"/>
+                <w:rFonts w:eastAsiaTheme="majorEastAsia"/>
+              </w:rPr>
+              <w:t>{ instance_id, status, completed_date }</w:t>
+            </w:r>
+          </w:p>
+        </w:tc>
+        <w:tc>
+          <w:tcPr>
+            <w:tcW w:w="0" w:type="auto"/>
+            <w:vAlign w:val="center"/>
+            <w:hideMark/>
+          </w:tcPr>
+          <w:p>
+            <w:r>
+              <w:t>Updates a task instance status (mark as done, pending, etc.).</w:t>
+            </w:r>
+          </w:p>
+        </w:tc>
+      </w:tr>
+      <w:tr>
+        <w:trPr>
+          <w:tblCellSpacing w:w="15" w:type="dxa"/>
+        </w:trPr>
+        <w:tc>
+          <w:tcPr>
+            <w:tcW w:w="0" w:type="auto"/>
+            <w:vAlign w:val="center"/>
+            <w:hideMark/>
+          </w:tcPr>
+          <w:p>
+            <w:r>
+              <w:rPr>
+                <w:rStyle w:val="HTMLCode"/>
+                <w:rFonts w:eastAsiaTheme="majorEastAsia"/>
+              </w:rPr>
+              <w:t>/categories</w:t>
+            </w:r>
+          </w:p>
+        </w:tc>
+        <w:tc>
+          <w:tcPr>
+            <w:tcW w:w="0" w:type="auto"/>
+            <w:vAlign w:val="center"/>
+            <w:hideMark/>
+          </w:tcPr>
+          <w:p>
+            <w:r>
+              <w:t>GET</w:t>
+            </w:r>
+          </w:p>
+        </w:tc>
+        <w:tc>
+          <w:tcPr>
+            <w:tcW w:w="0" w:type="auto"/>
+            <w:vAlign w:val="center"/>
+            <w:hideMark/>
+          </w:tcPr>
+          <w:p>
+            <w:r>
+              <w:rPr>
+                <w:rStyle w:val="HTMLCode"/>
+                <w:rFonts w:eastAsiaTheme="majorEastAsia"/>
+              </w:rPr>
+              <w:t>[ { id, name } ]</w:t>
+            </w:r>
+          </w:p>
+        </w:tc>
+        <w:tc>
+          <w:tcPr>
+            <w:tcW w:w="0" w:type="auto"/>
+            <w:vAlign w:val="center"/>
+            <w:hideMark/>
+          </w:tcPr>
+          <w:p>
+            <w:r>
+              <w:t>Returns available task categories for dropdown selection.</w:t>
+            </w:r>
+          </w:p>
+        </w:tc>
+      </w:tr>
+      <w:tr>
+        <w:trPr>
+          <w:tblCellSpacing w:w="15" w:type="dxa"/>
+        </w:trPr>
+        <w:tc>
+          <w:tcPr>
+            <w:tcW w:w="0" w:type="auto"/>
+            <w:vAlign w:val="center"/>
+            <w:hideMark/>
+          </w:tcPr>
+          <w:p>
+            <w:r>
+              <w:rPr>
+                <w:rStyle w:val="HTMLCode"/>
+                <w:rFonts w:eastAsiaTheme="majorEastAsia"/>
+              </w:rPr>
+              <w:t>/priorities</w:t>
+            </w:r>
+          </w:p>
+        </w:tc>
+        <w:tc>
+          <w:tcPr>
+            <w:tcW w:w="0" w:type="auto"/>
+            <w:vAlign w:val="center"/>
+            <w:hideMark/>
+          </w:tcPr>
+          <w:p>
+            <w:r>
+              <w:t>GET</w:t>
+            </w:r>
+          </w:p>
+        </w:tc>
+        <w:tc>
+          <w:tcPr>
+            <w:tcW w:w="0" w:type="auto"/>
+            <w:vAlign w:val="center"/>
+            <w:hideMark/>
+          </w:tcPr>
+          <w:p>
+            <w:r>
+              <w:rPr>
+                <w:rStyle w:val="HTMLCode"/>
+                <w:rFonts w:eastAsiaTheme="majorEastAsia"/>
+              </w:rPr>
+              <w:t>[ { id, name } ]</w:t>
+            </w:r>
+          </w:p>
+        </w:tc>
+        <w:tc>
+          <w:tcPr>
+            <w:tcW w:w="0" w:type="auto"/>
+            <w:vAlign w:val="center"/>
+            <w:hideMark/>
+          </w:tcPr>
+          <w:p>
+            <w:r>
+              <w:t>Returns available priority levels.</w:t>
+            </w:r>
+          </w:p>
+        </w:tc>
+      </w:tr>
+      <w:tr>
+        <w:trPr>
+          <w:tblCellSpacing w:w="15" w:type="dxa"/>
+        </w:trPr>
+        <w:tc>
+          <w:tcPr>
+            <w:tcW w:w="0" w:type="auto"/>
+            <w:vAlign w:val="center"/>
+            <w:hideMark/>
+          </w:tcPr>
+          <w:p>
+            <w:r>
+              <w:rPr>
+                <w:rStyle w:val="HTMLCode"/>
+                <w:rFonts w:eastAsiaTheme="majorEastAsia"/>
+              </w:rPr>
+              <w:t>/frequencies</w:t>
+            </w:r>
+          </w:p>
+        </w:tc>
+        <w:tc>
+          <w:tcPr>
+            <w:tcW w:w="0" w:type="auto"/>
+            <w:vAlign w:val="center"/>
+            <w:hideMark/>
+          </w:tcPr>
+          <w:p>
+            <w:r>
+              <w:t>GET</w:t>
+            </w:r>
+          </w:p>
+        </w:tc>
+        <w:tc>
+          <w:tcPr>
+            <w:tcW w:w="0" w:type="auto"/>
+            <w:vAlign w:val="center"/>
+            <w:hideMark/>
+          </w:tcPr>
+          <w:p>
+            <w:r>
+              <w:rPr>
+                <w:rStyle w:val="HTMLCode"/>
+                <w:rFonts w:eastAsiaTheme="majorEastAsia"/>
+              </w:rPr>
+              <w:t>[ { id, name } ]</w:t>
+            </w:r>
+          </w:p>
+        </w:tc>
+        <w:tc>
+          <w:tcPr>
+            <w:tcW w:w="0" w:type="auto"/>
+            <w:vAlign w:val="center"/>
+            <w:hideMark/>
+          </w:tcPr>
+          <w:p>
+            <w:r>
+              <w:t>Returns recurrence types (once, daily, weekly, monthly).</w:t>
+            </w:r>
+          </w:p>
+        </w:tc>
+      </w:tr>
+      <w:tr>
+        <w:trPr>
+          <w:tblCellSpacing w:w="15" w:type="dxa"/>
+        </w:trPr>
+        <w:tc>
+          <w:tcPr>
+            <w:tcW w:w="0" w:type="auto"/>
+            <w:vAlign w:val="center"/>
+            <w:hideMark/>
+          </w:tcPr>
+          <w:p>
+            <w:r>
+              <w:rPr>
+                <w:rStyle w:val="HTMLCode"/>
+                <w:rFonts w:eastAsiaTheme="majorEastAsia"/>
+              </w:rPr>
+              <w:t>/notifications</w:t>
+            </w:r>
+          </w:p>
+        </w:tc>
+        <w:tc>
+          <w:tcPr>
+            <w:tcW w:w="0" w:type="auto"/>
+            <w:vAlign w:val="center"/>
+            <w:hideMark/>
+          </w:tcPr>
+          <w:p>
+            <w:r>
+              <w:t>GET</w:t>
+            </w:r>
+          </w:p>
+        </w:tc>
+        <w:tc>
+          <w:tcPr>
+            <w:tcW w:w="0" w:type="auto"/>
+            <w:vAlign w:val="center"/>
+            <w:hideMark/>
+          </w:tcPr>
+          <w:p>
+            <w:r>
+              <w:rPr>
+                <w:rStyle w:val="HTMLCode"/>
+                <w:rFonts w:eastAsiaTheme="majorEastAsia"/>
+              </w:rPr>
+              <w:t>[ { task_instance_id, message, type } ]</w:t>
+            </w:r>
+          </w:p>
+        </w:tc>
+        <w:tc>
+          <w:tcPr>
+            <w:tcW w:w="0" w:type="auto"/>
+            <w:vAlign w:val="center"/>
+            <w:hideMark/>
+          </w:tcPr>
+          <w:p>
+            <w:r>
+              <w:t>Retrieves reminders and task notifications for the user.</w:t>
+            </w:r>
+          </w:p>
+        </w:tc>
+      </w:tr>
+    </w:tbl>
+    <w:p>
+      <w:pPr>
+        <w:pStyle w:val="HTMLPreformatted"/>
+        <w:rPr>
+          <w:rStyle w:val="HTMLCode"/>
+          <w:rFonts w:asciiTheme="minorHAnsi" w:eastAsiaTheme="majorEastAsia" w:hAnsiTheme="minorHAnsi"/>
+          <w:sz w:val="22"/>
+          <w:szCs w:val="22"/>
+          <w:lang w:val="en-MX"/>
+        </w:rPr>
+      </w:pPr>
+    </w:p>
+    <w:p>
+      <w:pPr>
+        <w:pStyle w:val="Heading1"/>
+        <w:rPr>
+          <w:sz w:val="48"/>
+          <w:szCs w:val="48"/>
+        </w:rPr>
+      </w:pPr>
+      <w:r>
+        <w:t>Key Architectural Layers</w:t>
+      </w:r>
+    </w:p>
+    <w:tbl>
+      <w:tblPr>
+        <w:tblW w:w="0" w:type="auto"/>
+        <w:tblCellSpacing w:w="15" w:type="dxa"/>
+        <w:tblCellMar>
+          <w:top w:w="15" w:type="dxa"/>
+          <w:left w:w="15" w:type="dxa"/>
+          <w:bottom w:w="15" w:type="dxa"/>
+          <w:right w:w="15" w:type="dxa"/>
+        </w:tblCellMar>
+        <w:tblLook w:val="04A0" w:firstRow="1" w:lastRow="0" w:firstColumn="1" w:lastColumn="0" w:noHBand="0" w:noVBand="1"/>
+      </w:tblPr>
+      <w:tblGrid>
+        <w:gridCol w:w="1603"/>
+        <w:gridCol w:w="5046"/>
+      </w:tblGrid>
+      <w:tr>
+        <w:trPr>
+          <w:tblHeader/>
+          <w:tblCellSpacing w:w="15" w:type="dxa"/>
+        </w:trPr>
+        <w:tc>
+          <w:tcPr>
+            <w:tcW w:w="0" w:type="auto"/>
+            <w:vAlign w:val="center"/>
+            <w:hideMark/>
+          </w:tcPr>
+          <w:p>
+            <w:pPr>
+              <w:jc w:val="center"/>
+              <w:rPr>
+                <w:b/>
+                <w:bCs/>
+              </w:rPr>
+            </w:pPr>
+            <w:r>
+              <w:rPr>
+                <w:b/>
+                <w:bCs/>
+              </w:rPr>
+              <w:t>Layer</w:t>
+            </w:r>
+          </w:p>
+        </w:tc>
+        <w:tc>
+          <w:tcPr>
+            <w:tcW w:w="0" w:type="auto"/>
+            <w:vAlign w:val="center"/>
+            <w:hideMark/>
+          </w:tcPr>
+          <w:p>
+            <w:pPr>
+              <w:jc w:val="center"/>
+              <w:rPr>
+                <w:b/>
+                <w:bCs/>
+              </w:rPr>
+            </w:pPr>
+            <w:r>
+              <w:rPr>
+                <w:b/>
+                <w:bCs/>
+              </w:rPr>
+              <w:t>What it represents</w:t>
+            </w:r>
+          </w:p>
+        </w:tc>
+      </w:tr>
+      <w:tr>
+        <w:trPr>
+          <w:tblCellSpacing w:w="15" w:type="dxa"/>
+        </w:trPr>
+        <w:tc>
+          <w:tcPr>
+            <w:tcW w:w="0" w:type="auto"/>
+            <w:vAlign w:val="center"/>
+            <w:hideMark/>
+          </w:tcPr>
+          <w:p>
+            <w:r>
+              <w:rPr>
+                <w:rStyle w:val="Strong"/>
+                <w:rFonts w:eastAsiaTheme="majorEastAsia"/>
+              </w:rPr>
+              <w:t>Tasks</w:t>
+            </w:r>
+          </w:p>
+        </w:tc>
+        <w:tc>
+          <w:tcPr>
+            <w:tcW w:w="0" w:type="auto"/>
+            <w:vAlign w:val="center"/>
+            <w:hideMark/>
+          </w:tcPr>
+          <w:p>
+            <w:r>
+              <w:t>The definition of a task (title, category, priority).</w:t>
+            </w:r>
+          </w:p>
+        </w:tc>
+      </w:tr>
+      <w:tr>
+        <w:trPr>
+          <w:tblCellSpacing w:w="15" w:type="dxa"/>
+        </w:trPr>
+        <w:tc>
+          <w:tcPr>
+            <w:tcW w:w="0" w:type="auto"/>
+            <w:vAlign w:val="center"/>
+            <w:hideMark/>
+          </w:tcPr>
+          <w:p>
+            <w:r>
+              <w:rPr>
+                <w:rStyle w:val="Strong"/>
+                <w:rFonts w:eastAsiaTheme="majorEastAsia"/>
+              </w:rPr>
+              <w:t>Task Schedule</w:t>
+            </w:r>
+          </w:p>
+        </w:tc>
+        <w:tc>
+          <w:tcPr>
+            <w:tcW w:w="0" w:type="auto"/>
+            <w:vAlign w:val="center"/>
+            <w:hideMark/>
+          </w:tcPr>
+          <w:p>
+            <w:r>
+              <w:t>How often the task repeats (weekly, days of week).</w:t>
+            </w:r>
+          </w:p>
+        </w:tc>
+      </w:tr>
+      <w:tr>
+        <w:trPr>
+          <w:tblCellSpacing w:w="15" w:type="dxa"/>
+        </w:trPr>
+        <w:tc>
+          <w:tcPr>
+            <w:tcW w:w="0" w:type="auto"/>
+            <w:vAlign w:val="center"/>
+            <w:hideMark/>
+          </w:tcPr>
+          <w:p>
+            <w:r>
+              <w:rPr>
+                <w:rStyle w:val="Strong"/>
+                <w:rFonts w:eastAsiaTheme="majorEastAsia"/>
+              </w:rPr>
+              <w:t>Task Instances</w:t>
+            </w:r>
+          </w:p>
+        </w:tc>
+        <w:tc>
+          <w:tcPr>
+            <w:tcW w:w="0" w:type="auto"/>
+            <w:vAlign w:val="center"/>
+            <w:hideMark/>
+          </w:tcPr>
+          <w:p>
+            <w:r>
+              <w:t>The actual occurrence of the task on a specific date.</w:t>
+            </w:r>
+          </w:p>
+        </w:tc>
+      </w:tr>
+    </w:tbl>
+    <w:p>
+      <w:pPr>
+        <w:pStyle w:val="NormalWeb"/>
+      </w:pPr>
+      <w:proofErr w:type="spellStart"/>
+      <w:r>
+        <w:t>Example</w:t>
+      </w:r>
+      <w:proofErr w:type="spellEnd"/>
+      <w:r>
+        <w:t>:</w:t>
+      </w:r>
+    </w:p>
+    <w:tbl>
+      <w:tblPr>
+        <w:tblW w:w="0" w:type="auto"/>
+        <w:tblCellSpacing w:w="15" w:type="dxa"/>
+        <w:tblCellMar>
+          <w:top w:w="15" w:type="dxa"/>
+          <w:left w:w="15" w:type="dxa"/>
+          <w:bottom w:w="15" w:type="dxa"/>
+          <w:right w:w="15" w:type="dxa"/>
+        </w:tblCellMar>
+        <w:tblLook w:val="04A0" w:firstRow="1" w:lastRow="0" w:firstColumn="1" w:lastColumn="0" w:noHBand="0" w:noVBand="1"/>
+      </w:tblPr>
+      <w:tblGrid>
+        <w:gridCol w:w="1109"/>
+        <w:gridCol w:w="981"/>
+        <w:gridCol w:w="1922"/>
+      </w:tblGrid>
+      <w:tr>
+        <w:trPr>
+          <w:tblHeader/>
+          <w:tblCellSpacing w:w="15" w:type="dxa"/>
+        </w:trPr>
+        <w:tc>
+          <w:tcPr>
+            <w:tcW w:w="0" w:type="auto"/>
+            <w:vAlign w:val="center"/>
+            <w:hideMark/>
+          </w:tcPr>
+          <w:p>
+            <w:pPr>
+              <w:jc w:val="center"/>
+              <w:rPr>
+                <w:b/>
+                <w:bCs/>
+              </w:rPr>
+            </w:pPr>
+            <w:r>
+              <w:rPr>
+                <w:b/>
+                <w:bCs/>
+              </w:rPr>
+              <w:t>Task</w:t>
+            </w:r>
+          </w:p>
+        </w:tc>
+        <w:tc>
+          <w:tcPr>
+            <w:tcW w:w="0" w:type="auto"/>
+            <w:vAlign w:val="center"/>
+            <w:hideMark/>
+          </w:tcPr>
+          <w:p>
+            <w:pPr>
+              <w:jc w:val="center"/>
+              <w:rPr>
+                <w:b/>
+                <w:bCs/>
+              </w:rPr>
+            </w:pPr>
+            <w:r>
+              <w:rPr>
+                <w:b/>
+                <w:bCs/>
+              </w:rPr>
+              <w:t>Schedule</w:t>
+            </w:r>
+          </w:p>
+        </w:tc>
+        <w:tc>
+          <w:tcPr>
+            <w:tcW w:w="0" w:type="auto"/>
+            <w:vAlign w:val="center"/>
+            <w:hideMark/>
+          </w:tcPr>
+          <w:p>
+            <w:pPr>
+              <w:jc w:val="center"/>
+              <w:rPr>
+                <w:b/>
+                <w:bCs/>
+              </w:rPr>
+            </w:pPr>
+            <w:r>
+              <w:rPr>
+                <w:b/>
+                <w:bCs/>
+              </w:rPr>
+              <w:t>Instance</w:t>
+            </w:r>
+          </w:p>
+        </w:tc>
+      </w:tr>
+      <w:tr>
+        <w:trPr>
+          <w:tblCellSpacing w:w="15" w:type="dxa"/>
+        </w:trPr>
+        <w:tc>
+          <w:tcPr>
+            <w:tcW w:w="0" w:type="auto"/>
+            <w:vAlign w:val="center"/>
+            <w:hideMark/>
+          </w:tcPr>
+          <w:p>
+            <w:r>
+              <w:t>Mop Floor</w:t>
+            </w:r>
+          </w:p>
+        </w:tc>
+        <w:tc>
+          <w:tcPr>
+            <w:tcW w:w="0" w:type="auto"/>
+            <w:vAlign w:val="center"/>
+            <w:hideMark/>
+          </w:tcPr>
+          <w:p>
+            <w:r>
+              <w:t>Tue, Fri</w:t>
+            </w:r>
+          </w:p>
+        </w:tc>
+        <w:tc>
+          <w:tcPr>
+            <w:tcW w:w="0" w:type="auto"/>
+            <w:vAlign w:val="center"/>
+            <w:hideMark/>
+          </w:tcPr>
+          <w:p>
+            <w:r>
+              <w:t>Mar 10 → Pending</w:t>
+            </w:r>
+          </w:p>
+        </w:tc>
+      </w:tr>
+      <w:tr>
+        <w:trPr>
+          <w:tblCellSpacing w:w="15" w:type="dxa"/>
+        </w:trPr>
+        <w:tc>
+          <w:tcPr>
+            <w:tcW w:w="0" w:type="auto"/>
+            <w:vAlign w:val="center"/>
+            <w:hideMark/>
+          </w:tcPr>
+          <w:p>
+            <w:r>
+              <w:t>Mop Floor</w:t>
+            </w:r>
+          </w:p>
+        </w:tc>
+        <w:tc>
+          <w:tcPr>
+            <w:tcW w:w="0" w:type="auto"/>
+            <w:vAlign w:val="center"/>
+            <w:hideMark/>
+          </w:tcPr>
+          <w:p>
+            <w:r>
+              <w:t>Tue, Fri</w:t>
+            </w:r>
+          </w:p>
+        </w:tc>
+        <w:tc>
+          <w:tcPr>
+            <w:tcW w:w="0" w:type="auto"/>
+            <w:vAlign w:val="center"/>
+            <w:hideMark/>
+          </w:tcPr>
+          <w:p>
+            <w:r>
+              <w:t>Mar 13 → Done</w:t>
+            </w:r>
+          </w:p>
+        </w:tc>
+      </w:tr>
+    </w:tbl>
+    <w:p>
+      <w:pPr>
+        <w:pStyle w:val="HTMLPreformatted"/>
+        <w:rPr>
+          <w:rStyle w:val="HTMLCode"/>
+          <w:rFonts w:asciiTheme="minorHAnsi" w:eastAsiaTheme="majorEastAsia" w:hAnsiTheme="minorHAnsi"/>
+          <w:sz w:val="22"/>
+          <w:szCs w:val="22"/>
+        </w:rPr>
+      </w:pPr>
     </w:p>
     <w:p/>
     <w:p>
@@ -8199,6 +9549,7 @@
           <w:sz w:val="28"/>
           <w:szCs w:val="28"/>
         </w:rPr>
+        <w:lastRenderedPageBreak/>
         <w:t>RACI chart</w:t>
       </w:r>
     </w:p>

</xml_diff>

<commit_message>
modified:   PlanDataModelAndDesign/flowtasks 	modified:   PlanDataModelAndDesign/project-plan.docx 	new file:   PlanDataModelAndDesign/~$oject-plan.docx
</commit_message>
<xml_diff>
--- a/PlanDataModelAndDesign/project-plan.docx
+++ b/PlanDataModelAndDesign/project-plan.docx
@@ -1778,7 +1778,13 @@
               <w:cnfStyle w:val="000000100000" w:firstRow="0" w:lastRow="0" w:firstColumn="0" w:lastColumn="0" w:oddVBand="0" w:evenVBand="0" w:oddHBand="1" w:evenHBand="0" w:firstRowFirstColumn="0" w:firstRowLastColumn="0" w:lastRowFirstColumn="0" w:lastRowLastColumn="0"/>
             </w:pPr>
             <w:r>
-              <w:t>Set up environment (Node.js, Express, React, PostgreSQL).</w:t>
+              <w:t xml:space="preserve">Set up environment (Node.js, </w:t>
+            </w:r>
+            <w:r>
+              <w:t>Next</w:t>
+            </w:r>
+            <w:r>
+              <w:t>, React, PostgreSQL).</w:t>
             </w:r>
           </w:p>
           <w:p>

</xml_diff>